<commit_message>
Ändrat metoden AddData i HomeController
</commit_message>
<xml_diff>
--- a/Arkiv/CineScope – Weekly Mini Project.docx
+++ b/Arkiv/CineScope – Weekly Mini Project.docx
@@ -260,15 +260,7 @@
     </w:p>
     <w:p>
       <w:r>
-        <w:t>Category Filtering</w:t>
-      </w:r>
-      <w:proofErr w:type="gramStart"/>
-      <w:r>
-        <w:t xml:space="preserve">   (</w:t>
-      </w:r>
-      <w:proofErr w:type="gramEnd"/>
-      <w:r>
-        <w:t xml:space="preserve">vilket jag tolkade som genrer filtrering) </w:t>
+        <w:t xml:space="preserve">Category Filtering   (vilket jag tolkade som genrer filtrering) </w:t>
       </w:r>
     </w:p>
     <w:p>
@@ -289,25 +281,7 @@
     </w:p>
     <w:p>
       <w:r>
-        <w:t>På index-s</w:t>
-      </w:r>
-      <w:r>
-        <w:t xml:space="preserve">idan </w:t>
-      </w:r>
-      <w:r>
-        <w:t xml:space="preserve">i admin-avdelningen, allstå den som visar alla filmer, fungerar bara responsiviteten </w:t>
-      </w:r>
-      <w:r>
-        <w:t>ner till 600px</w:t>
-      </w:r>
-      <w:r>
-        <w:t xml:space="preserve">. På övriga sidor </w:t>
-      </w:r>
-      <w:r>
-        <w:t>fungerar responsiviteten</w:t>
-      </w:r>
-      <w:r>
-        <w:t xml:space="preserve"> ner till 370px eller ännu bättre.</w:t>
+        <w:t>På index-sidan i admin-avdelningen, allstå den som visar alla filmer, fungerar bara responsiviteten ner till 600px. På övriga sidor fungerar responsiviteten ner till 370px eller ännu bättre.</w:t>
       </w:r>
     </w:p>
     <w:p>
@@ -328,11 +302,6 @@
       </w:r>
       <w:r>
         <w:t>och sedan ange filnamnet i systemet.</w:t>
-      </w:r>
-    </w:p>
-    <w:p>
-      <w:r>
-        <w:t>På startsidan är bildspelet högst upp hårdkodat, jag försökte göra det med en foreach-sats men fick det inte att fungera.</w:t>
       </w:r>
     </w:p>
     <w:p>
@@ -462,13 +431,16 @@
         <w:t>Det enda jag använt AI till är att göra uml-diagramet. Alltså jag lät Visual Studios  Github Copilot</w:t>
       </w:r>
       <w:r>
+        <w:t xml:space="preserve">  </w:t>
+      </w:r>
+      <w:r>
+        <w:t>göra diagrammet. Det blev dock katastrofalt dåligt</w:t>
+      </w:r>
+      <w:r>
+        <w:t>.</w:t>
+      </w:r>
+      <w:r>
         <w:t xml:space="preserve"> </w:t>
-      </w:r>
-      <w:r>
-        <w:t xml:space="preserve"> </w:t>
-      </w:r>
-      <w:r>
-        <w:t xml:space="preserve">göra diagrammet. Det blev dock katastrofalt dåligt </w:t>
       </w:r>
       <w:r>
         <w:t>Github Copilot</w:t>
@@ -1169,6 +1141,7 @@
   <w:style w:type="character" w:default="1" w:styleId="Standardstycketeckensnitt">
     <w:name w:val="Default Paragraph Font"/>
     <w:uiPriority w:val="1"/>
+    <w:semiHidden/>
     <w:unhideWhenUsed/>
   </w:style>
   <w:style w:type="table" w:default="1" w:styleId="Normaltabell">

</xml_diff>